<commit_message>
Update Sanity Testing heading to Smoke Testing
</commit_message>
<xml_diff>
--- a/Part-A/test-reports/01_Sanity_Testing_Report.docx
+++ b/Part-A/test-reports/01_Sanity_Testing_Report.docx
@@ -19,7 +19,15 @@
       <w:bookmarkEnd w:id="0"/>
       <w:r>
         <w:rPr/>
-        <w:t>SANITY TESTING REPORT</w:t>
+        <w:t>S</w:t>
+      </w:r>
+      <w:r>
+        <w:rPr/>
+        <w:t>MOKE</w:t>
+      </w:r>
+      <w:r>
+        <w:rPr/>
+        <w:t xml:space="preserve"> TESTING REPORT</w:t>
       </w:r>
     </w:p>
     <w:p>
@@ -598,27 +606,7 @@
                 <w:szCs w:val="24"/>
                 <w:lang w:val="en-US" w:eastAsia="en-US" w:bidi="ar-SA"/>
               </w:rPr>
-              <w:t>Apr 2</w:t>
-            </w:r>
-            <w:r>
-              <w:rPr>
-                <w:rFonts w:eastAsia="Cambria"/>
-                <w:kern w:val="0"/>
-                <w:sz w:val="24"/>
-                <w:szCs w:val="24"/>
-                <w:lang w:val="en-US" w:eastAsia="en-US" w:bidi="ar-SA"/>
-              </w:rPr>
-              <w:t>8</w:t>
-            </w:r>
-            <w:r>
-              <w:rPr>
-                <w:rFonts w:eastAsia="Cambria"/>
-                <w:kern w:val="0"/>
-                <w:sz w:val="24"/>
-                <w:szCs w:val="24"/>
-                <w:lang w:val="en-US" w:eastAsia="en-US" w:bidi="ar-SA"/>
-              </w:rPr>
-              <w:t>, 2026</w:t>
+              <w:t>Apr 28, 2026</w:t>
             </w:r>
           </w:p>
         </w:tc>
@@ -756,17 +744,7 @@
                 <w:szCs w:val="24"/>
                 <w:lang w:val="en-US" w:eastAsia="en-US" w:bidi="ar-SA"/>
               </w:rPr>
-              <w:t>Stage-2026.04.2</w:t>
-            </w:r>
-            <w:r>
-              <w:rPr>
-                <w:rFonts w:eastAsia="Cambria"/>
-                <w:kern w:val="0"/>
-                <w:sz w:val="24"/>
-                <w:szCs w:val="24"/>
-                <w:lang w:val="en-US" w:eastAsia="en-US" w:bidi="ar-SA"/>
-              </w:rPr>
-              <w:t>8</w:t>
+              <w:t>Stage-2026.04.28</w:t>
             </w:r>
           </w:p>
         </w:tc>
@@ -1022,8 +1000,8 @@
         <w:pStyle w:val="Normal"/>
         <w:rPr/>
       </w:pPr>
-      <w:bookmarkStart w:id="4" w:name="out-of-scope"/>
-      <w:bookmarkStart w:id="5" w:name="executive-summary"/>
+      <w:bookmarkStart w:id="4" w:name="executive-summary"/>
+      <w:bookmarkStart w:id="5" w:name="out-of-scope"/>
       <w:r>
         <w:rPr/>
         <mc:AlternateContent>
@@ -2402,8 +2380,8 @@
       </w:tblPr>
       <w:tblGrid>
         <w:gridCol w:w="839"/>
-        <w:gridCol w:w="1800"/>
-        <w:gridCol w:w="2040"/>
+        <w:gridCol w:w="1799"/>
+        <w:gridCol w:w="2041"/>
         <w:gridCol w:w="1440"/>
         <w:gridCol w:w="1200"/>
         <w:gridCol w:w="960"/>
@@ -2453,7 +2431,7 @@
         </w:tc>
         <w:tc>
           <w:tcPr>
-            <w:tcW w:w="1800" w:type="dxa"/>
+            <w:tcW w:w="1799" w:type="dxa"/>
             <w:tcBorders>
               <w:bottom w:val="single" w:sz="6" w:space="0" w:color="000000"/>
             </w:tcBorders>
@@ -2491,7 +2469,7 @@
         </w:tc>
         <w:tc>
           <w:tcPr>
-            <w:tcW w:w="2040" w:type="dxa"/>
+            <w:tcW w:w="2041" w:type="dxa"/>
             <w:tcBorders>
               <w:bottom w:val="single" w:sz="6" w:space="0" w:color="000000"/>
             </w:tcBorders>
@@ -2715,7 +2693,7 @@
         </w:tc>
         <w:tc>
           <w:tcPr>
-            <w:tcW w:w="1800" w:type="dxa"/>
+            <w:tcW w:w="1799" w:type="dxa"/>
             <w:tcBorders/>
           </w:tcPr>
           <w:p>
@@ -2746,7 +2724,7 @@
         </w:tc>
         <w:tc>
           <w:tcPr>
-            <w:tcW w:w="2040" w:type="dxa"/>
+            <w:tcW w:w="2041" w:type="dxa"/>
             <w:tcBorders/>
           </w:tcPr>
           <w:p>
@@ -2937,7 +2915,7 @@
         </w:tc>
         <w:tc>
           <w:tcPr>
-            <w:tcW w:w="1800" w:type="dxa"/>
+            <w:tcW w:w="1799" w:type="dxa"/>
             <w:tcBorders/>
           </w:tcPr>
           <w:p>
@@ -2968,7 +2946,7 @@
         </w:tc>
         <w:tc>
           <w:tcPr>
-            <w:tcW w:w="2040" w:type="dxa"/>
+            <w:tcW w:w="2041" w:type="dxa"/>
             <w:tcBorders/>
           </w:tcPr>
           <w:p>
@@ -3159,7 +3137,7 @@
         </w:tc>
         <w:tc>
           <w:tcPr>
-            <w:tcW w:w="1800" w:type="dxa"/>
+            <w:tcW w:w="1799" w:type="dxa"/>
             <w:tcBorders/>
           </w:tcPr>
           <w:p>
@@ -3190,7 +3168,7 @@
         </w:tc>
         <w:tc>
           <w:tcPr>
-            <w:tcW w:w="2040" w:type="dxa"/>
+            <w:tcW w:w="2041" w:type="dxa"/>
             <w:tcBorders/>
           </w:tcPr>
           <w:p>
@@ -3376,13 +3354,13 @@
         </w:tblCellMar>
       </w:tblPr>
       <w:tblGrid>
-        <w:gridCol w:w="899"/>
+        <w:gridCol w:w="898"/>
         <w:gridCol w:w="1800"/>
-        <w:gridCol w:w="1996"/>
+        <w:gridCol w:w="1997"/>
         <w:gridCol w:w="1350"/>
         <w:gridCol w:w="1259"/>
-        <w:gridCol w:w="1081"/>
-        <w:gridCol w:w="1319"/>
+        <w:gridCol w:w="1082"/>
+        <w:gridCol w:w="1318"/>
       </w:tblGrid>
       <w:tr>
         <w:trPr>
@@ -3390,7 +3368,7 @@
         </w:trPr>
         <w:tc>
           <w:tcPr>
-            <w:tcW w:w="899" w:type="dxa"/>
+            <w:tcW w:w="898" w:type="dxa"/>
             <w:tcBorders>
               <w:bottom w:val="single" w:sz="6" w:space="0" w:color="000000"/>
             </w:tcBorders>
@@ -3466,7 +3444,7 @@
         </w:tc>
         <w:tc>
           <w:tcPr>
-            <w:tcW w:w="1996" w:type="dxa"/>
+            <w:tcW w:w="1997" w:type="dxa"/>
             <w:tcBorders>
               <w:bottom w:val="single" w:sz="6" w:space="0" w:color="000000"/>
             </w:tcBorders>
@@ -3580,7 +3558,7 @@
         </w:tc>
         <w:tc>
           <w:tcPr>
-            <w:tcW w:w="1081" w:type="dxa"/>
+            <w:tcW w:w="1082" w:type="dxa"/>
             <w:tcBorders>
               <w:bottom w:val="single" w:sz="6" w:space="0" w:color="000000"/>
             </w:tcBorders>
@@ -3618,7 +3596,7 @@
         </w:tc>
         <w:tc>
           <w:tcPr>
-            <w:tcW w:w="1319" w:type="dxa"/>
+            <w:tcW w:w="1318" w:type="dxa"/>
             <w:tcBorders>
               <w:bottom w:val="single" w:sz="6" w:space="0" w:color="000000"/>
             </w:tcBorders>
@@ -3659,7 +3637,7 @@
         <w:trPr/>
         <w:tc>
           <w:tcPr>
-            <w:tcW w:w="899" w:type="dxa"/>
+            <w:tcW w:w="898" w:type="dxa"/>
             <w:tcBorders/>
           </w:tcPr>
           <w:p>
@@ -3721,7 +3699,7 @@
         </w:tc>
         <w:tc>
           <w:tcPr>
-            <w:tcW w:w="1996" w:type="dxa"/>
+            <w:tcW w:w="1997" w:type="dxa"/>
             <w:tcBorders/>
           </w:tcPr>
           <w:p>
@@ -3814,7 +3792,7 @@
         </w:tc>
         <w:tc>
           <w:tcPr>
-            <w:tcW w:w="1081" w:type="dxa"/>
+            <w:tcW w:w="1082" w:type="dxa"/>
             <w:tcBorders/>
           </w:tcPr>
           <w:p>
@@ -3847,7 +3825,7 @@
         </w:tc>
         <w:tc>
           <w:tcPr>
-            <w:tcW w:w="1319" w:type="dxa"/>
+            <w:tcW w:w="1318" w:type="dxa"/>
             <w:tcBorders/>
           </w:tcPr>
           <w:p>
@@ -3881,7 +3859,7 @@
         <w:trPr/>
         <w:tc>
           <w:tcPr>
-            <w:tcW w:w="899" w:type="dxa"/>
+            <w:tcW w:w="898" w:type="dxa"/>
             <w:tcBorders/>
           </w:tcPr>
           <w:p>
@@ -3943,7 +3921,7 @@
         </w:tc>
         <w:tc>
           <w:tcPr>
-            <w:tcW w:w="1996" w:type="dxa"/>
+            <w:tcW w:w="1997" w:type="dxa"/>
             <w:tcBorders/>
           </w:tcPr>
           <w:p>
@@ -4036,7 +4014,7 @@
         </w:tc>
         <w:tc>
           <w:tcPr>
-            <w:tcW w:w="1081" w:type="dxa"/>
+            <w:tcW w:w="1082" w:type="dxa"/>
             <w:tcBorders/>
           </w:tcPr>
           <w:p>
@@ -4069,7 +4047,7 @@
         </w:tc>
         <w:tc>
           <w:tcPr>
-            <w:tcW w:w="1319" w:type="dxa"/>
+            <w:tcW w:w="1318" w:type="dxa"/>
             <w:tcBorders/>
           </w:tcPr>
           <w:p>
@@ -4105,7 +4083,7 @@
         </w:trPr>
         <w:tc>
           <w:tcPr>
-            <w:tcW w:w="899" w:type="dxa"/>
+            <w:tcW w:w="898" w:type="dxa"/>
             <w:tcBorders/>
           </w:tcPr>
           <w:p>
@@ -4167,7 +4145,7 @@
         </w:tc>
         <w:tc>
           <w:tcPr>
-            <w:tcW w:w="1996" w:type="dxa"/>
+            <w:tcW w:w="1997" w:type="dxa"/>
             <w:tcBorders/>
           </w:tcPr>
           <w:p>
@@ -4260,7 +4238,7 @@
         </w:tc>
         <w:tc>
           <w:tcPr>
-            <w:tcW w:w="1081" w:type="dxa"/>
+            <w:tcW w:w="1082" w:type="dxa"/>
             <w:tcBorders/>
           </w:tcPr>
           <w:p>
@@ -4293,7 +4271,7 @@
         </w:tc>
         <w:tc>
           <w:tcPr>
-            <w:tcW w:w="1319" w:type="dxa"/>
+            <w:tcW w:w="1318" w:type="dxa"/>
             <w:tcBorders/>
           </w:tcPr>
           <w:p>
@@ -7066,9 +7044,9 @@
       </w:tblPr>
       <w:tblGrid>
         <w:gridCol w:w="2236"/>
-        <w:gridCol w:w="2035"/>
+        <w:gridCol w:w="2034"/>
         <w:gridCol w:w="1628"/>
-        <w:gridCol w:w="1833"/>
+        <w:gridCol w:w="1834"/>
         <w:gridCol w:w="1628"/>
       </w:tblGrid>
       <w:tr>
@@ -7115,7 +7093,7 @@
         </w:tc>
         <w:tc>
           <w:tcPr>
-            <w:tcW w:w="2035" w:type="dxa"/>
+            <w:tcW w:w="2034" w:type="dxa"/>
             <w:tcBorders>
               <w:bottom w:val="single" w:sz="6" w:space="0" w:color="000000"/>
             </w:tcBorders>
@@ -7191,7 +7169,7 @@
         </w:tc>
         <w:tc>
           <w:tcPr>
-            <w:tcW w:w="1833" w:type="dxa"/>
+            <w:tcW w:w="1834" w:type="dxa"/>
             <w:tcBorders>
               <w:bottom w:val="single" w:sz="6" w:space="0" w:color="000000"/>
             </w:tcBorders>
@@ -7301,7 +7279,7 @@
         </w:tc>
         <w:tc>
           <w:tcPr>
-            <w:tcW w:w="2035" w:type="dxa"/>
+            <w:tcW w:w="2034" w:type="dxa"/>
             <w:tcBorders/>
           </w:tcPr>
           <w:p>
@@ -7363,7 +7341,7 @@
         </w:tc>
         <w:tc>
           <w:tcPr>
-            <w:tcW w:w="1833" w:type="dxa"/>
+            <w:tcW w:w="1834" w:type="dxa"/>
             <w:tcBorders/>
           </w:tcPr>
           <w:p>
@@ -7459,7 +7437,7 @@
         </w:tc>
         <w:tc>
           <w:tcPr>
-            <w:tcW w:w="2035" w:type="dxa"/>
+            <w:tcW w:w="2034" w:type="dxa"/>
             <w:tcBorders/>
           </w:tcPr>
           <w:p>
@@ -7521,7 +7499,7 @@
         </w:tc>
         <w:tc>
           <w:tcPr>
-            <w:tcW w:w="1833" w:type="dxa"/>
+            <w:tcW w:w="1834" w:type="dxa"/>
             <w:tcBorders/>
           </w:tcPr>
           <w:p>
@@ -10126,8 +10104,8 @@
         <w:pStyle w:val="Normal"/>
         <w:rPr/>
       </w:pPr>
-      <w:bookmarkStart w:id="15" w:name="module-wise-results"/>
-      <w:bookmarkStart w:id="16" w:name="sanity-test-metrics"/>
+      <w:bookmarkStart w:id="15" w:name="sanity-test-metrics"/>
+      <w:bookmarkStart w:id="16" w:name="module-wise-results"/>
       <w:r>
         <w:rPr/>
         <mc:AlternateContent>
@@ -10356,8 +10334,8 @@
         <w:pStyle w:val="Normal"/>
         <w:rPr/>
       </w:pPr>
-      <w:bookmarkStart w:id="19" w:name="re-test-requirements"/>
-      <w:bookmarkStart w:id="20" w:name="recommendations"/>
+      <w:bookmarkStart w:id="19" w:name="recommendations"/>
+      <w:bookmarkStart w:id="20" w:name="re-test-requirements"/>
       <w:r>
         <w:rPr/>
         <mc:AlternateContent>
@@ -11148,10 +11126,10 @@
           <w:iCs/>
         </w:rPr>
       </w:r>
-      <w:bookmarkStart w:id="23" w:name="sign-off_Copy_1"/>
-      <w:bookmarkStart w:id="24" w:name="sanity-testing-report_Copy_1"/>
-      <w:bookmarkStart w:id="25" w:name="sign-off_Copy_1"/>
-      <w:bookmarkStart w:id="26" w:name="sanity-testing-report_Copy_1"/>
+      <w:bookmarkStart w:id="23" w:name="sanity-testing-report_Copy_1"/>
+      <w:bookmarkStart w:id="24" w:name="sign-off_Copy_1"/>
+      <w:bookmarkStart w:id="25" w:name="sanity-testing-report_Copy_1"/>
+      <w:bookmarkStart w:id="26" w:name="sign-off_Copy_1"/>
       <w:bookmarkEnd w:id="25"/>
       <w:bookmarkEnd w:id="26"/>
     </w:p>
@@ -11310,8 +11288,8 @@
   <w:abstractNum w:abstractNumId="2">
     <w:lvl w:ilvl="0">
       <w:start w:val="1"/>
-      <w:numFmt w:val="decimal"/>
-      <w:lvlText w:val="%1."/>
+      <w:numFmt w:val="bullet"/>
+      <w:lvlText w:val=""/>
       <w:lvlJc w:val="left"/>
       <w:pPr>
         <w:tabs>
@@ -11319,12 +11297,14 @@
         </w:tabs>
         <w:ind w:left="720" w:hanging="480"/>
       </w:pPr>
-      <w:rPr/>
+      <w:rPr>
+        <w:rFonts w:ascii="Symbol" w:hAnsi="Symbol" w:cs="Symbol" w:hint="default"/>
+      </w:rPr>
     </w:lvl>
     <w:lvl w:ilvl="1">
       <w:start w:val="1"/>
-      <w:numFmt w:val="decimal"/>
-      <w:lvlText w:val="%2."/>
+      <w:numFmt w:val="bullet"/>
+      <w:lvlText w:val=""/>
       <w:lvlJc w:val="left"/>
       <w:pPr>
         <w:tabs>
@@ -11332,12 +11312,14 @@
         </w:tabs>
         <w:ind w:left="1440" w:hanging="480"/>
       </w:pPr>
-      <w:rPr/>
+      <w:rPr>
+        <w:rFonts w:ascii="Symbol" w:hAnsi="Symbol" w:cs="Symbol" w:hint="default"/>
+      </w:rPr>
     </w:lvl>
     <w:lvl w:ilvl="2">
       <w:start w:val="1"/>
-      <w:numFmt w:val="decimal"/>
-      <w:lvlText w:val="%3."/>
+      <w:numFmt w:val="bullet"/>
+      <w:lvlText w:val=""/>
       <w:lvlJc w:val="left"/>
       <w:pPr>
         <w:tabs>
@@ -11345,12 +11327,14 @@
         </w:tabs>
         <w:ind w:left="2160" w:hanging="480"/>
       </w:pPr>
-      <w:rPr/>
+      <w:rPr>
+        <w:rFonts w:ascii="Symbol" w:hAnsi="Symbol" w:cs="Symbol" w:hint="default"/>
+      </w:rPr>
     </w:lvl>
     <w:lvl w:ilvl="3">
       <w:start w:val="1"/>
-      <w:numFmt w:val="decimal"/>
-      <w:lvlText w:val="%4."/>
+      <w:numFmt w:val="bullet"/>
+      <w:lvlText w:val=""/>
       <w:lvlJc w:val="left"/>
       <w:pPr>
         <w:tabs>
@@ -11358,12 +11342,14 @@
         </w:tabs>
         <w:ind w:left="2880" w:hanging="480"/>
       </w:pPr>
-      <w:rPr/>
+      <w:rPr>
+        <w:rFonts w:ascii="Symbol" w:hAnsi="Symbol" w:cs="Symbol" w:hint="default"/>
+      </w:rPr>
     </w:lvl>
     <w:lvl w:ilvl="4">
       <w:start w:val="1"/>
-      <w:numFmt w:val="decimal"/>
-      <w:lvlText w:val="%5."/>
+      <w:numFmt w:val="bullet"/>
+      <w:lvlText w:val=""/>
       <w:lvlJc w:val="left"/>
       <w:pPr>
         <w:tabs>
@@ -11371,12 +11357,14 @@
         </w:tabs>
         <w:ind w:left="3600" w:hanging="480"/>
       </w:pPr>
-      <w:rPr/>
+      <w:rPr>
+        <w:rFonts w:ascii="Symbol" w:hAnsi="Symbol" w:cs="Symbol" w:hint="default"/>
+      </w:rPr>
     </w:lvl>
     <w:lvl w:ilvl="5">
       <w:start w:val="1"/>
-      <w:numFmt w:val="decimal"/>
-      <w:lvlText w:val="%6."/>
+      <w:numFmt w:val="bullet"/>
+      <w:lvlText w:val=""/>
       <w:lvlJc w:val="left"/>
       <w:pPr>
         <w:tabs>
@@ -11384,12 +11372,14 @@
         </w:tabs>
         <w:ind w:left="4320" w:hanging="480"/>
       </w:pPr>
-      <w:rPr/>
+      <w:rPr>
+        <w:rFonts w:ascii="Symbol" w:hAnsi="Symbol" w:cs="Symbol" w:hint="default"/>
+      </w:rPr>
     </w:lvl>
     <w:lvl w:ilvl="6">
       <w:start w:val="1"/>
-      <w:numFmt w:val="decimal"/>
-      <w:lvlText w:val="%7."/>
+      <w:numFmt w:val="bullet"/>
+      <w:lvlText w:val=""/>
       <w:lvlJc w:val="left"/>
       <w:pPr>
         <w:tabs>
@@ -11397,12 +11387,14 @@
         </w:tabs>
         <w:ind w:left="5040" w:hanging="480"/>
       </w:pPr>
-      <w:rPr/>
+      <w:rPr>
+        <w:rFonts w:ascii="Symbol" w:hAnsi="Symbol" w:cs="Symbol" w:hint="default"/>
+      </w:rPr>
     </w:lvl>
     <w:lvl w:ilvl="7">
       <w:start w:val="1"/>
-      <w:numFmt w:val="decimal"/>
-      <w:lvlText w:val="%8."/>
+      <w:numFmt w:val="bullet"/>
+      <w:lvlText w:val=""/>
       <w:lvlJc w:val="left"/>
       <w:pPr>
         <w:tabs>
@@ -11410,12 +11402,14 @@
         </w:tabs>
         <w:ind w:left="5760" w:hanging="480"/>
       </w:pPr>
-      <w:rPr/>
+      <w:rPr>
+        <w:rFonts w:ascii="Symbol" w:hAnsi="Symbol" w:cs="Symbol" w:hint="default"/>
+      </w:rPr>
     </w:lvl>
     <w:lvl w:ilvl="8">
       <w:start w:val="1"/>
-      <w:numFmt w:val="decimal"/>
-      <w:lvlText w:val="%9."/>
+      <w:numFmt w:val="bullet"/>
+      <w:lvlText w:val=""/>
       <w:lvlJc w:val="left"/>
       <w:pPr>
         <w:tabs>
@@ -11423,7 +11417,9 @@
         </w:tabs>
         <w:ind w:left="6480" w:hanging="480"/>
       </w:pPr>
-      <w:rPr/>
+      <w:rPr>
+        <w:rFonts w:ascii="Symbol" w:hAnsi="Symbol" w:cs="Symbol" w:hint="default"/>
+      </w:rPr>
     </w:lvl>
   </w:abstractNum>
   <w:abstractNum w:abstractNumId="3">
@@ -12251,8 +12247,8 @@
   <w:abstractNum w:abstractNumId="9">
     <w:lvl w:ilvl="0">
       <w:start w:val="1"/>
-      <w:numFmt w:val="bullet"/>
-      <w:lvlText w:val=""/>
+      <w:numFmt w:val="decimal"/>
+      <w:lvlText w:val="%1."/>
       <w:lvlJc w:val="left"/>
       <w:pPr>
         <w:tabs>
@@ -12260,14 +12256,12 @@
         </w:tabs>
         <w:ind w:left="720" w:hanging="480"/>
       </w:pPr>
-      <w:rPr>
-        <w:rFonts w:ascii="Symbol" w:hAnsi="Symbol" w:cs="Symbol" w:hint="default"/>
-      </w:rPr>
+      <w:rPr/>
     </w:lvl>
     <w:lvl w:ilvl="1">
       <w:start w:val="1"/>
-      <w:numFmt w:val="bullet"/>
-      <w:lvlText w:val=""/>
+      <w:numFmt w:val="decimal"/>
+      <w:lvlText w:val="%2."/>
       <w:lvlJc w:val="left"/>
       <w:pPr>
         <w:tabs>
@@ -12275,14 +12269,12 @@
         </w:tabs>
         <w:ind w:left="1440" w:hanging="480"/>
       </w:pPr>
-      <w:rPr>
-        <w:rFonts w:ascii="Symbol" w:hAnsi="Symbol" w:cs="Symbol" w:hint="default"/>
-      </w:rPr>
+      <w:rPr/>
     </w:lvl>
     <w:lvl w:ilvl="2">
       <w:start w:val="1"/>
-      <w:numFmt w:val="bullet"/>
-      <w:lvlText w:val=""/>
+      <w:numFmt w:val="decimal"/>
+      <w:lvlText w:val="%3."/>
       <w:lvlJc w:val="left"/>
       <w:pPr>
         <w:tabs>
@@ -12290,14 +12282,12 @@
         </w:tabs>
         <w:ind w:left="2160" w:hanging="480"/>
       </w:pPr>
-      <w:rPr>
-        <w:rFonts w:ascii="Symbol" w:hAnsi="Symbol" w:cs="Symbol" w:hint="default"/>
-      </w:rPr>
+      <w:rPr/>
     </w:lvl>
     <w:lvl w:ilvl="3">
       <w:start w:val="1"/>
-      <w:numFmt w:val="bullet"/>
-      <w:lvlText w:val=""/>
+      <w:numFmt w:val="decimal"/>
+      <w:lvlText w:val="%4."/>
       <w:lvlJc w:val="left"/>
       <w:pPr>
         <w:tabs>
@@ -12305,14 +12295,12 @@
         </w:tabs>
         <w:ind w:left="2880" w:hanging="480"/>
       </w:pPr>
-      <w:rPr>
-        <w:rFonts w:ascii="Symbol" w:hAnsi="Symbol" w:cs="Symbol" w:hint="default"/>
-      </w:rPr>
+      <w:rPr/>
     </w:lvl>
     <w:lvl w:ilvl="4">
       <w:start w:val="1"/>
-      <w:numFmt w:val="bullet"/>
-      <w:lvlText w:val=""/>
+      <w:numFmt w:val="decimal"/>
+      <w:lvlText w:val="%5."/>
       <w:lvlJc w:val="left"/>
       <w:pPr>
         <w:tabs>
@@ -12320,14 +12308,12 @@
         </w:tabs>
         <w:ind w:left="3600" w:hanging="480"/>
       </w:pPr>
-      <w:rPr>
-        <w:rFonts w:ascii="Symbol" w:hAnsi="Symbol" w:cs="Symbol" w:hint="default"/>
-      </w:rPr>
+      <w:rPr/>
     </w:lvl>
     <w:lvl w:ilvl="5">
       <w:start w:val="1"/>
-      <w:numFmt w:val="bullet"/>
-      <w:lvlText w:val=""/>
+      <w:numFmt w:val="decimal"/>
+      <w:lvlText w:val="%6."/>
       <w:lvlJc w:val="left"/>
       <w:pPr>
         <w:tabs>
@@ -12335,14 +12321,12 @@
         </w:tabs>
         <w:ind w:left="4320" w:hanging="480"/>
       </w:pPr>
-      <w:rPr>
-        <w:rFonts w:ascii="Symbol" w:hAnsi="Symbol" w:cs="Symbol" w:hint="default"/>
-      </w:rPr>
+      <w:rPr/>
     </w:lvl>
     <w:lvl w:ilvl="6">
       <w:start w:val="1"/>
-      <w:numFmt w:val="bullet"/>
-      <w:lvlText w:val=""/>
+      <w:numFmt w:val="decimal"/>
+      <w:lvlText w:val="%7."/>
       <w:lvlJc w:val="left"/>
       <w:pPr>
         <w:tabs>
@@ -12350,14 +12334,12 @@
         </w:tabs>
         <w:ind w:left="5040" w:hanging="480"/>
       </w:pPr>
-      <w:rPr>
-        <w:rFonts w:ascii="Symbol" w:hAnsi="Symbol" w:cs="Symbol" w:hint="default"/>
-      </w:rPr>
+      <w:rPr/>
     </w:lvl>
     <w:lvl w:ilvl="7">
       <w:start w:val="1"/>
-      <w:numFmt w:val="bullet"/>
-      <w:lvlText w:val=""/>
+      <w:numFmt w:val="decimal"/>
+      <w:lvlText w:val="%8."/>
       <w:lvlJc w:val="left"/>
       <w:pPr>
         <w:tabs>
@@ -12365,14 +12347,12 @@
         </w:tabs>
         <w:ind w:left="5760" w:hanging="480"/>
       </w:pPr>
-      <w:rPr>
-        <w:rFonts w:ascii="Symbol" w:hAnsi="Symbol" w:cs="Symbol" w:hint="default"/>
-      </w:rPr>
+      <w:rPr/>
     </w:lvl>
     <w:lvl w:ilvl="8">
       <w:start w:val="1"/>
-      <w:numFmt w:val="bullet"/>
-      <w:lvlText w:val=""/>
+      <w:numFmt w:val="decimal"/>
+      <w:lvlText w:val="%9."/>
       <w:lvlJc w:val="left"/>
       <w:pPr>
         <w:tabs>
@@ -12380,9 +12360,7 @@
         </w:tabs>
         <w:ind w:left="6480" w:hanging="480"/>
       </w:pPr>
-      <w:rPr>
-        <w:rFonts w:ascii="Symbol" w:hAnsi="Symbol" w:cs="Symbol" w:hint="default"/>
-      </w:rPr>
+      <w:rPr/>
     </w:lvl>
   </w:abstractNum>
   <w:abstractNum w:abstractNumId="10">
@@ -13798,13 +13776,13 @@
     <w:abstractNumId w:val="1"/>
   </w:num>
   <w:num w:numId="27">
-    <w:abstractNumId w:val="10"/>
+    <w:abstractNumId w:val="9"/>
     <w:lvlOverride w:ilvl="0">
       <w:startOverride w:val="1"/>
     </w:lvlOverride>
   </w:num>
   <w:num w:numId="28">
-    <w:abstractNumId w:val="10"/>
+    <w:abstractNumId w:val="9"/>
   </w:num>
   <w:num w:numId="29">
     <w:abstractNumId w:val="1"/>
@@ -13856,7 +13834,7 @@
     <w:pPr>
       <w:widowControl/>
       <w:suppressAutoHyphens w:val="true"/>
-      <w:overflowPunct w:val="false"/>
+      <w:overflowPunct w:val="true"/>
       <w:bidi w:val="0"/>
       <w:spacing w:before="0" w:after="200"/>
       <w:jc w:val="left"/>
@@ -14497,7 +14475,7 @@
       <w:keepLines/>
       <w:widowControl/>
       <w:suppressAutoHyphens w:val="true"/>
-      <w:overflowPunct w:val="false"/>
+      <w:overflowPunct w:val="true"/>
       <w:bidi w:val="0"/>
       <w:spacing w:before="0" w:after="200"/>
       <w:jc w:val="center"/>
@@ -14520,7 +14498,7 @@
       <w:keepLines/>
       <w:widowControl/>
       <w:suppressAutoHyphens w:val="true"/>
-      <w:overflowPunct w:val="false"/>
+      <w:overflowPunct w:val="true"/>
       <w:bidi w:val="0"/>
       <w:spacing w:before="0" w:after="200"/>
       <w:jc w:val="center"/>

</xml_diff>